<commit_message>
Format handbook source and regenerate docx
</commit_message>
<xml_diff>
--- a/新手学习手册.docx
+++ b/新手学习手册.docx
@@ -84,7 +84,7 @@
         <w:t xml:space="preserve">rl_admittance_rehab_ws</w:t>
       </w:r>
       <w:r>
-        <w:br/>
+        <w:t xml:space="preserve"> </w:t>
       </w:r>
       <w:r>
         <w:rPr>
@@ -99,7 +99,7 @@
         <w:t xml:space="preserve">Phase 0–10</w:t>
       </w:r>
       <w:r>
-        <w:br/>
+        <w:t xml:space="preserve"> </w:t>
       </w:r>
       <w:r>
         <w:rPr>

</xml_diff>